<commit_message>
fix country name inconsistencies in report
</commit_message>
<xml_diff>
--- a/analysis/2026-07-mtr/ida21_policy_commitment.docx
+++ b/analysis/2026-07-mtr/ida21_policy_commitment.docx
@@ -66,7 +66,7 @@
           <w:b/>
           <w:bCs/>
         </w:rPr>
-        <w:t xml:space="preserve">41 countries</w:t>
+        <w:t xml:space="preserve">42 countries</w:t>
       </w:r>
       <w:r>
         <w:t xml:space="preserve">, of which</w:t>
@@ -258,19 +258,19 @@
               <w:jc w:val="right"/>
             </w:pPr>
             <w:r>
-              <w:t xml:space="preserve">27</w:t>
-            </w:r>
-          </w:p>
-        </w:tc>
-        <w:tc>
-          <w:tcPr/>
-          <w:p>
-            <w:pPr>
-              <w:pStyle w:val="Compact"/>
-              <w:jc w:val="right"/>
-            </w:pPr>
-            <w:r>
-              <w:t xml:space="preserve">41</w:t>
+              <w:t xml:space="preserve">26</w:t>
+            </w:r>
+          </w:p>
+        </w:tc>
+        <w:tc>
+          <w:tcPr/>
+          <w:p>
+            <w:pPr>
+              <w:pStyle w:val="Compact"/>
+              <w:jc w:val="right"/>
+            </w:pPr>
+            <w:r>
+              <w:t xml:space="preserve">42</w:t>
             </w:r>
           </w:p>
         </w:tc>
@@ -622,7 +622,7 @@
               <w:jc w:val="right"/>
             </w:pPr>
             <w:r>
-              <w:t xml:space="preserve">21</w:t>
+              <w:t xml:space="preserve">20</w:t>
             </w:r>
           </w:p>
         </w:tc>
@@ -2982,7 +2982,7 @@
               <w:jc w:val="right"/>
             </w:pPr>
             <w:r>
-              <w:t xml:space="preserve">24</w:t>
+              <w:t xml:space="preserve">23</w:t>
             </w:r>
           </w:p>
         </w:tc>
@@ -3006,7 +3006,7 @@
               <w:jc w:val="right"/>
             </w:pPr>
             <w:r>
-              <w:t xml:space="preserve">38</w:t>
+              <w:t xml:space="preserve">39</w:t>
             </w:r>
           </w:p>
         </w:tc>
@@ -3581,7 +3581,7 @@
               <w:jc w:val="right"/>
             </w:pPr>
             <w:r>
-              <w:t xml:space="preserve">38</w:t>
+              <w:t xml:space="preserve">39</w:t>
             </w:r>
           </w:p>
         </w:tc>

</xml_diff>